<commit_message>
first commit banking system
</commit_message>
<xml_diff>
--- a/Program references.docx
+++ b/Program references.docx
@@ -17,83 +17,8 @@
           <w:lang w:val="en-US"/>
         </w:rPr>
       </w:pPr>
-    </w:p>
-    <w:p>
-      <w:pPr>
-        <w:rPr>
-          <w:rFonts w:hint="default"/>
-          <w:lang w:val="en-US"/>
-        </w:rPr>
-      </w:pPr>
-      <w:r>
-        <w:rPr>
-          <w:rFonts w:hint="default"/>
-          <w:lang w:val="en-US"/>
-        </w:rPr>
-        <w:t>Project link:</w:t>
-      </w:r>
-      <w:r>
-        <w:rPr>
-          <w:rFonts w:hint="default"/>
-          <w:lang w:val="en-US"/>
-        </w:rPr>
-        <w:fldChar w:fldCharType="begin"/>
-      </w:r>
-      <w:r>
-        <w:rPr>
-          <w:rFonts w:hint="default"/>
-          <w:lang w:val="en-US"/>
-        </w:rPr>
-        <w:instrText xml:space="preserve"> HYPERLINK "https://github.com/bokhabanentshema77-debug/bankingsystem.git" </w:instrText>
-      </w:r>
-      <w:r>
-        <w:rPr>
-          <w:rFonts w:hint="default"/>
-          <w:lang w:val="en-US"/>
-        </w:rPr>
-        <w:fldChar w:fldCharType="separate"/>
-      </w:r>
-      <w:r>
-        <w:rPr>
-          <w:rStyle w:val="4"/>
-          <w:rFonts w:hint="default"/>
-          <w:lang w:val="en-US"/>
-        </w:rPr>
-        <w:t>https://github.com/bo</w:t>
-      </w:r>
       <w:bookmarkStart w:id="0" w:name="_GoBack"/>
       <w:bookmarkEnd w:id="0"/>
-      <w:r>
-        <w:rPr>
-          <w:rStyle w:val="4"/>
-          <w:rFonts w:hint="default"/>
-          <w:lang w:val="en-US"/>
-        </w:rPr>
-        <w:t>khabanentshema77-debug/bankingsystem.git</w:t>
-      </w:r>
-      <w:r>
-        <w:rPr>
-          <w:rFonts w:hint="default"/>
-          <w:lang w:val="en-US"/>
-        </w:rPr>
-        <w:fldChar w:fldCharType="end"/>
-      </w:r>
-    </w:p>
-    <w:p>
-      <w:pPr>
-        <w:rPr>
-          <w:rFonts w:hint="default"/>
-          <w:lang w:val="en-US"/>
-        </w:rPr>
-      </w:pPr>
-    </w:p>
-    <w:p>
-      <w:pPr>
-        <w:rPr>
-          <w:rFonts w:hint="default"/>
-          <w:lang w:val="en-US"/>
-        </w:rPr>
-      </w:pPr>
     </w:p>
     <w:p>
       <w:pPr>
@@ -1166,7 +1091,7 @@
     <w:lsdException w:unhideWhenUsed="0" w:uiPriority="0" w:semiHidden="0" w:name="HTML Acronym"/>
     <w:lsdException w:unhideWhenUsed="0" w:uiPriority="0" w:semiHidden="0" w:name="HTML Address"/>
     <w:lsdException w:unhideWhenUsed="0" w:uiPriority="0" w:semiHidden="0" w:name="HTML Cite"/>
-    <w:lsdException w:unhideWhenUsed="0" w:uiPriority="0" w:semiHidden="0" w:name="HTML Code"/>
+    <w:lsdException w:qFormat="1" w:unhideWhenUsed="0" w:uiPriority="0" w:semiHidden="0" w:name="HTML Code"/>
     <w:lsdException w:unhideWhenUsed="0" w:uiPriority="0" w:semiHidden="0" w:name="HTML Definition"/>
     <w:lsdException w:unhideWhenUsed="0" w:uiPriority="0" w:semiHidden="0" w:name="HTML Keyboard"/>
     <w:lsdException w:unhideWhenUsed="0" w:uiPriority="0" w:semiHidden="0" w:name="HTML Preformatted"/>
@@ -1360,6 +1285,7 @@
   <w:style w:type="character" w:styleId="5">
     <w:name w:val="HTML Code"/>
     <w:basedOn w:val="2"/>
+    <w:qFormat/>
     <w:uiPriority w:val="0"/>
     <w:rPr>
       <w:rFonts w:ascii="Courier New" w:hAnsi="Courier New" w:cs="Courier New"/>

</xml_diff>